<commit_message>
FINAL COMMIT - COMPLETED THESIS
</commit_message>
<xml_diff>
--- a/Doc/Progress/Progress_10thMarch.docx
+++ b/Doc/Progress/Progress_10thMarch.docx
@@ -8162,61 +8162,6 @@
           <w:lang w:val="en-IN" w:eastAsia="en-US"/>
         </w:rPr>
       </w:pPr>
-      <w:r>
-        <w:rPr>
-          <w:noProof/>
-          <w:lang w:eastAsia="en-US"/>
-        </w:rPr>
-        <w:drawing>
-          <wp:inline distT="0" distB="0" distL="0" distR="0" wp14:anchorId="55E3169F" wp14:editId="03E7B20C">
-            <wp:extent cx="5010365" cy="1095456"/>
-            <wp:effectExtent l="0" t="0" r="0" b="9525"/>
-            <wp:docPr id="5" name="Picture 4">
-              <a:extLst xmlns:a="http://schemas.openxmlformats.org/drawingml/2006/main">
-                <a:ext uri="{FF2B5EF4-FFF2-40B4-BE49-F238E27FC236}">
-                  <a16:creationId xmlns:a16="http://schemas.microsoft.com/office/drawing/2014/main" id="{3BD536B8-95AF-A93E-E2D3-EE78C4EB14DE}"/>
-                </a:ext>
-              </a:extLst>
-            </wp:docPr>
-            <wp:cNvGraphicFramePr>
-              <a:graphicFrameLocks xmlns:a="http://schemas.openxmlformats.org/drawingml/2006/main" noChangeAspect="1"/>
-            </wp:cNvGraphicFramePr>
-            <a:graphic xmlns:a="http://schemas.openxmlformats.org/drawingml/2006/main">
-              <a:graphicData uri="http://schemas.openxmlformats.org/drawingml/2006/picture">
-                <pic:pic xmlns:pic="http://schemas.openxmlformats.org/drawingml/2006/picture">
-                  <pic:nvPicPr>
-                    <pic:cNvPr id="5" name="Picture 4">
-                      <a:extLst>
-                        <a:ext uri="{FF2B5EF4-FFF2-40B4-BE49-F238E27FC236}">
-                          <a16:creationId xmlns:a16="http://schemas.microsoft.com/office/drawing/2014/main" id="{3BD536B8-95AF-A93E-E2D3-EE78C4EB14DE}"/>
-                        </a:ext>
-                      </a:extLst>
-                    </pic:cNvPr>
-                    <pic:cNvPicPr>
-                      <a:picLocks noChangeAspect="1"/>
-                    </pic:cNvPicPr>
-                  </pic:nvPicPr>
-                  <pic:blipFill>
-                    <a:blip r:embed="rId9"/>
-                    <a:stretch>
-                      <a:fillRect/>
-                    </a:stretch>
-                  </pic:blipFill>
-                  <pic:spPr>
-                    <a:xfrm>
-                      <a:off x="0" y="0"/>
-                      <a:ext cx="5010365" cy="1095456"/>
-                    </a:xfrm>
-                    <a:prstGeom prst="rect">
-                      <a:avLst/>
-                    </a:prstGeom>
-                  </pic:spPr>
-                </pic:pic>
-              </a:graphicData>
-            </a:graphic>
-          </wp:inline>
-        </w:drawing>
-      </w:r>
     </w:p>
     <w:p>
       <w:pPr>
@@ -8348,7 +8293,6 @@
         <w:rPr>
           <w:lang w:val="en-IN" w:eastAsia="en-US"/>
         </w:rPr>
-        <w:lastRenderedPageBreak/>
         <w:t>REFERENCES</w:t>
       </w:r>
     </w:p>
@@ -8460,56 +8404,7 @@
           <w:szCs w:val="24"/>
           <w:lang w:val="en-US"/>
         </w:rPr>
-        <w:t>IEEE Transactions on Software Engineering</w:t>
-      </w:r>
-      <w:r>
-        <w:rPr>
-          <w:rFonts w:ascii="Times New Roman" w:eastAsia="Times New Roman" w:hAnsi="Times New Roman" w:cs="Times New Roman"/>
-          <w:sz w:val="24"/>
-          <w:szCs w:val="24"/>
-          <w:lang w:val="en-US"/>
-        </w:rPr>
-        <w:t xml:space="preserve">, vol. 50, no. 9, pp. 2254-2268, Sept. 2024, </w:t>
-      </w:r>
-      <w:proofErr w:type="spellStart"/>
-      <w:r>
-        <w:rPr>
-          <w:rFonts w:ascii="Times New Roman" w:eastAsia="Times New Roman" w:hAnsi="Times New Roman" w:cs="Times New Roman"/>
-          <w:sz w:val="24"/>
-          <w:szCs w:val="24"/>
-          <w:lang w:val="en-US"/>
-        </w:rPr>
-        <w:t>doi</w:t>
-      </w:r>
-      <w:proofErr w:type="spellEnd"/>
-      <w:r>
-        <w:rPr>
-          <w:rFonts w:ascii="Times New Roman" w:eastAsia="Times New Roman" w:hAnsi="Times New Roman" w:cs="Times New Roman"/>
-          <w:sz w:val="24"/>
-          <w:szCs w:val="24"/>
-          <w:lang w:val="en-US"/>
-        </w:rPr>
-        <w:t>: 10.1109/TSE.2024.3428972.</w:t>
-      </w:r>
-    </w:p>
-    <w:p>
-      <w:pPr>
-        <w:spacing w:after="200" w:line="360" w:lineRule="auto"/>
-        <w:rPr>
-          <w:rFonts w:ascii="Times New Roman" w:eastAsia="Times New Roman" w:hAnsi="Times New Roman" w:cs="Times New Roman"/>
-          <w:sz w:val="24"/>
-          <w:szCs w:val="24"/>
-          <w:lang w:val="en-IN"/>
-        </w:rPr>
-      </w:pPr>
-      <w:r>
-        <w:rPr>
-          <w:rFonts w:ascii="Times New Roman" w:eastAsia="Times New Roman" w:hAnsi="Times New Roman" w:cs="Times New Roman"/>
-          <w:sz w:val="24"/>
-          <w:szCs w:val="24"/>
-          <w:lang w:val="en-US"/>
-        </w:rPr>
-        <w:t xml:space="preserve">[3] J. Chen, Z. Cai, W. Chen, W. Wang, Z. Zheng and P. S. Yu, "A Federated Adaptive Large Language Model Fine-Tuning Framework for Software Development," in </w:t>
+        <w:t xml:space="preserve">IEEE </w:t>
       </w:r>
       <w:r>
         <w:rPr>
@@ -8520,7 +8415,8 @@
           <w:szCs w:val="24"/>
           <w:lang w:val="en-US"/>
         </w:rPr>
-        <w:t>IEEE Transactions on Services Computing</w:t>
+        <w:lastRenderedPageBreak/>
+        <w:t>Transactions on Software Engineering</w:t>
       </w:r>
       <w:r>
         <w:rPr>
@@ -8529,7 +8425,7 @@
           <w:szCs w:val="24"/>
           <w:lang w:val="en-US"/>
         </w:rPr>
-        <w:t xml:space="preserve">, </w:t>
+        <w:t xml:space="preserve">, vol. 50, no. 9, pp. 2254-2268, Sept. 2024, </w:t>
       </w:r>
       <w:proofErr w:type="spellStart"/>
       <w:r>
@@ -8549,7 +8445,7 @@
           <w:szCs w:val="24"/>
           <w:lang w:val="en-US"/>
         </w:rPr>
-        <w:t>: 10.1109/TSC.2025.3623626</w:t>
+        <w:t>: 10.1109/TSE.2024.3428972.</w:t>
       </w:r>
     </w:p>
     <w:p>
@@ -8569,27 +8465,7 @@
           <w:szCs w:val="24"/>
           <w:lang w:val="en-US"/>
         </w:rPr>
-        <w:t xml:space="preserve">[4] M. Nashaat and J. Miller, "Towards Efficient Fine-Tuning of Language Models </w:t>
-      </w:r>
-      <w:proofErr w:type="gramStart"/>
-      <w:r>
-        <w:rPr>
-          <w:rFonts w:ascii="Times New Roman" w:eastAsia="Times New Roman" w:hAnsi="Times New Roman" w:cs="Times New Roman"/>
-          <w:sz w:val="24"/>
-          <w:szCs w:val="24"/>
-          <w:lang w:val="en-US"/>
-        </w:rPr>
-        <w:t>With</w:t>
-      </w:r>
-      <w:proofErr w:type="gramEnd"/>
-      <w:r>
-        <w:rPr>
-          <w:rFonts w:ascii="Times New Roman" w:eastAsia="Times New Roman" w:hAnsi="Times New Roman" w:cs="Times New Roman"/>
-          <w:sz w:val="24"/>
-          <w:szCs w:val="24"/>
-          <w:lang w:val="en-US"/>
-        </w:rPr>
-        <w:t xml:space="preserve"> Organizational Data for Automated Software Review," in </w:t>
+        <w:t xml:space="preserve">[3] J. Chen, Z. Cai, W. Chen, W. Wang, Z. Zheng and P. S. Yu, "A Federated Adaptive Large Language Model Fine-Tuning Framework for Software Development," in </w:t>
       </w:r>
       <w:r>
         <w:rPr>
@@ -8600,7 +8476,7 @@
           <w:szCs w:val="24"/>
           <w:lang w:val="en-US"/>
         </w:rPr>
-        <w:t>IEEE Transactions on Software Engineering</w:t>
+        <w:t>IEEE Transactions on Services Computing</w:t>
       </w:r>
       <w:r>
         <w:rPr>
@@ -8609,7 +8485,7 @@
           <w:szCs w:val="24"/>
           <w:lang w:val="en-US"/>
         </w:rPr>
-        <w:t xml:space="preserve">, vol. 50, no. 9, pp. 2240-2253, Sept. 2024, </w:t>
+        <w:t xml:space="preserve">, </w:t>
       </w:r>
       <w:proofErr w:type="spellStart"/>
       <w:r>
@@ -8629,7 +8505,7 @@
           <w:szCs w:val="24"/>
           <w:lang w:val="en-US"/>
         </w:rPr>
-        <w:t>: 10.1109/TSE.2024.3428324</w:t>
+        <w:t>: 10.1109/TSC.2025.3623626</w:t>
       </w:r>
     </w:p>
     <w:p>
@@ -8649,9 +8525,9 @@
           <w:szCs w:val="24"/>
           <w:lang w:val="en-US"/>
         </w:rPr>
-        <w:t xml:space="preserve">[5] R. </w:t>
-      </w:r>
-      <w:proofErr w:type="spellStart"/>
+        <w:t xml:space="preserve">[4] M. Nashaat and J. Miller, "Towards Efficient Fine-Tuning of Language Models </w:t>
+      </w:r>
+      <w:proofErr w:type="gramStart"/>
       <w:r>
         <w:rPr>
           <w:rFonts w:ascii="Times New Roman" w:eastAsia="Times New Roman" w:hAnsi="Times New Roman" w:cs="Times New Roman"/>
@@ -8659,9 +8535,9 @@
           <w:szCs w:val="24"/>
           <w:lang w:val="en-US"/>
         </w:rPr>
-        <w:t>Khojah</w:t>
-      </w:r>
-      <w:proofErr w:type="spellEnd"/>
+        <w:t>With</w:t>
+      </w:r>
+      <w:proofErr w:type="gramEnd"/>
       <w:r>
         <w:rPr>
           <w:rFonts w:ascii="Times New Roman" w:eastAsia="Times New Roman" w:hAnsi="Times New Roman" w:cs="Times New Roman"/>
@@ -8669,7 +8545,7 @@
           <w:szCs w:val="24"/>
           <w:lang w:val="en-US"/>
         </w:rPr>
-        <w:t xml:space="preserve">, F. G. de Oliveira Neto, M. Mohamad and P. Leitner, "The Impact of Prompt Programming on Function-Level Code Generation," in </w:t>
+        <w:t xml:space="preserve"> Organizational Data for Automated Software Review," in </w:t>
       </w:r>
       <w:r>
         <w:rPr>
@@ -8689,7 +8565,7 @@
           <w:szCs w:val="24"/>
           <w:lang w:val="en-US"/>
         </w:rPr>
-        <w:t xml:space="preserve">, vol. 51, no. 8, pp. 2381-2395, Aug. 2025, </w:t>
+        <w:t xml:space="preserve">, vol. 50, no. 9, pp. 2240-2253, Sept. 2024, </w:t>
       </w:r>
       <w:proofErr w:type="spellStart"/>
       <w:r>
@@ -8709,7 +8585,7 @@
           <w:szCs w:val="24"/>
           <w:lang w:val="en-US"/>
         </w:rPr>
-        <w:t>: 10.1109/TSE.2025.3587794</w:t>
+        <w:t>: 10.1109/TSE.2024.3428324</w:t>
       </w:r>
     </w:p>
     <w:p>
@@ -8729,9 +8605,9 @@
           <w:szCs w:val="24"/>
           <w:lang w:val="en-US"/>
         </w:rPr>
-        <w:t xml:space="preserve">[6] Q. Wang, C. Li, Y. Liu, Q. Zhu, J. Song and T. Shen, "An Adaptive Framework Embedded </w:t>
-      </w:r>
-      <w:proofErr w:type="gramStart"/>
+        <w:t xml:space="preserve">[5] R. </w:t>
+      </w:r>
+      <w:proofErr w:type="spellStart"/>
       <w:r>
         <w:rPr>
           <w:rFonts w:ascii="Times New Roman" w:eastAsia="Times New Roman" w:hAnsi="Times New Roman" w:cs="Times New Roman"/>
@@ -8739,9 +8615,9 @@
           <w:szCs w:val="24"/>
           <w:lang w:val="en-US"/>
         </w:rPr>
-        <w:t>With</w:t>
-      </w:r>
-      <w:proofErr w:type="gramEnd"/>
+        <w:t>Khojah</w:t>
+      </w:r>
+      <w:proofErr w:type="spellEnd"/>
       <w:r>
         <w:rPr>
           <w:rFonts w:ascii="Times New Roman" w:eastAsia="Times New Roman" w:hAnsi="Times New Roman" w:cs="Times New Roman"/>
@@ -8749,7 +8625,7 @@
           <w:szCs w:val="24"/>
           <w:lang w:val="en-US"/>
         </w:rPr>
-        <w:t xml:space="preserve"> LLM for Knowledge Graph Construction," in </w:t>
+        <w:t xml:space="preserve">, F. G. de Oliveira Neto, M. Mohamad and P. Leitner, "The Impact of Prompt Programming on Function-Level Code Generation," in </w:t>
       </w:r>
       <w:r>
         <w:rPr>
@@ -8760,7 +8636,7 @@
           <w:szCs w:val="24"/>
           <w:lang w:val="en-US"/>
         </w:rPr>
-        <w:t>IEEE Transactions on Multimedia</w:t>
+        <w:t>IEEE Transactions on Software Engineering</w:t>
       </w:r>
       <w:r>
         <w:rPr>
@@ -8769,7 +8645,7 @@
           <w:szCs w:val="24"/>
           <w:lang w:val="en-US"/>
         </w:rPr>
-        <w:t xml:space="preserve">, vol. 27, pp. 2912-2923, 2025, </w:t>
+        <w:t xml:space="preserve">, vol. 51, no. 8, pp. 2381-2395, Aug. 2025, </w:t>
       </w:r>
       <w:proofErr w:type="spellStart"/>
       <w:r>
@@ -8789,7 +8665,7 @@
           <w:szCs w:val="24"/>
           <w:lang w:val="en-US"/>
         </w:rPr>
-        <w:t>: 10.1109/TMM.2025.3557717</w:t>
+        <w:t>: 10.1109/TSE.2025.3587794</w:t>
       </w:r>
     </w:p>
     <w:p>
@@ -8809,7 +8685,7 @@
           <w:szCs w:val="24"/>
           <w:lang w:val="en-US"/>
         </w:rPr>
-        <w:t xml:space="preserve">[7] X. Yu, L. Liu, X. Hu, J. W. Keung, J. Liu and X. Xia, "Fight Fire </w:t>
+        <w:t xml:space="preserve">[6] Q. Wang, C. Li, Y. Liu, Q. Zhu, J. Song and T. Shen, "An Adaptive Framework Embedded </w:t>
       </w:r>
       <w:proofErr w:type="gramStart"/>
       <w:r>
@@ -8829,27 +8705,7 @@
           <w:szCs w:val="24"/>
           <w:lang w:val="en-US"/>
         </w:rPr>
-        <w:t xml:space="preserve"> Fire: How Much Can We Trust ChatGPT on Source Code-Related </w:t>
-      </w:r>
-      <w:proofErr w:type="gramStart"/>
-      <w:r>
-        <w:rPr>
-          <w:rFonts w:ascii="Times New Roman" w:eastAsia="Times New Roman" w:hAnsi="Times New Roman" w:cs="Times New Roman"/>
-          <w:sz w:val="24"/>
-          <w:szCs w:val="24"/>
-          <w:lang w:val="en-US"/>
-        </w:rPr>
-        <w:t>Tasks?,</w:t>
-      </w:r>
-      <w:proofErr w:type="gramEnd"/>
-      <w:r>
-        <w:rPr>
-          <w:rFonts w:ascii="Times New Roman" w:eastAsia="Times New Roman" w:hAnsi="Times New Roman" w:cs="Times New Roman"/>
-          <w:sz w:val="24"/>
-          <w:szCs w:val="24"/>
-          <w:lang w:val="en-US"/>
-        </w:rPr>
-        <w:t xml:space="preserve">" in </w:t>
+        <w:t xml:space="preserve"> LLM for Knowledge Graph Construction," in </w:t>
       </w:r>
       <w:r>
         <w:rPr>
@@ -8860,7 +8716,7 @@
           <w:szCs w:val="24"/>
           <w:lang w:val="en-US"/>
         </w:rPr>
-        <w:t>IEEE Transactions on Software Engineering</w:t>
+        <w:t>IEEE Transactions on Multimedia</w:t>
       </w:r>
       <w:r>
         <w:rPr>
@@ -8869,7 +8725,7 @@
           <w:szCs w:val="24"/>
           <w:lang w:val="en-US"/>
         </w:rPr>
-        <w:t xml:space="preserve">, vol. 50, no. 12, pp. 3435-3453, Dec. 2024, </w:t>
+        <w:t xml:space="preserve">, vol. 27, pp. 2912-2923, 2025, </w:t>
       </w:r>
       <w:proofErr w:type="spellStart"/>
       <w:r>
@@ -8889,7 +8745,7 @@
           <w:szCs w:val="24"/>
           <w:lang w:val="en-US"/>
         </w:rPr>
-        <w:t>: 10.1109/TSE.2024.3492204</w:t>
+        <w:t>: 10.1109/TMM.2025.3557717</w:t>
       </w:r>
     </w:p>
     <w:p>
@@ -8909,9 +8765,9 @@
           <w:szCs w:val="24"/>
           <w:lang w:val="en-US"/>
         </w:rPr>
-        <w:t>[8] X. Yi, C. Hu, B. Cai, H. Huang, Y. Chen and K. Wang, "</w:t>
-      </w:r>
-      <w:proofErr w:type="spellStart"/>
+        <w:t xml:space="preserve">[7] X. Yu, L. Liu, X. Hu, J. W. Keung, J. Liu and X. Xia, "Fight Fire </w:t>
+      </w:r>
+      <w:proofErr w:type="gramStart"/>
       <w:r>
         <w:rPr>
           <w:rFonts w:ascii="Times New Roman" w:eastAsia="Times New Roman" w:hAnsi="Times New Roman" w:cs="Times New Roman"/>
@@ -8919,9 +8775,9 @@
           <w:szCs w:val="24"/>
           <w:lang w:val="en-US"/>
         </w:rPr>
-        <w:t>FedALoRA</w:t>
-      </w:r>
-      <w:proofErr w:type="spellEnd"/>
+        <w:t>With</w:t>
+      </w:r>
+      <w:proofErr w:type="gramEnd"/>
       <w:r>
         <w:rPr>
           <w:rFonts w:ascii="Times New Roman" w:eastAsia="Times New Roman" w:hAnsi="Times New Roman" w:cs="Times New Roman"/>
@@ -8929,9 +8785,9 @@
           <w:szCs w:val="24"/>
           <w:lang w:val="en-US"/>
         </w:rPr>
-        <w:t xml:space="preserve">: Adaptive Local </w:t>
-      </w:r>
-      <w:proofErr w:type="spellStart"/>
+        <w:t xml:space="preserve"> Fire: How Much Can We Trust ChatGPT on Source Code-Related </w:t>
+      </w:r>
+      <w:proofErr w:type="gramStart"/>
       <w:r>
         <w:rPr>
           <w:rFonts w:ascii="Times New Roman" w:eastAsia="Times New Roman" w:hAnsi="Times New Roman" w:cs="Times New Roman"/>
@@ -8939,9 +8795,9 @@
           <w:szCs w:val="24"/>
           <w:lang w:val="en-US"/>
         </w:rPr>
-        <w:t>LoRA</w:t>
-      </w:r>
-      <w:proofErr w:type="spellEnd"/>
+        <w:t>Tasks?,</w:t>
+      </w:r>
+      <w:proofErr w:type="gramEnd"/>
       <w:r>
         <w:rPr>
           <w:rFonts w:ascii="Times New Roman" w:eastAsia="Times New Roman" w:hAnsi="Times New Roman" w:cs="Times New Roman"/>
@@ -8949,7 +8805,7 @@
           <w:szCs w:val="24"/>
           <w:lang w:val="en-US"/>
         </w:rPr>
-        <w:t xml:space="preserve"> Aggregation for Personalized Federated Learning in LLM," in </w:t>
+        <w:t xml:space="preserve">" in </w:t>
       </w:r>
       <w:r>
         <w:rPr>
@@ -8960,7 +8816,7 @@
           <w:szCs w:val="24"/>
           <w:lang w:val="en-US"/>
         </w:rPr>
-        <w:t>IEEE Internet of Things Journal</w:t>
+        <w:t>IEEE Transactions on Software Engineering</w:t>
       </w:r>
       <w:r>
         <w:rPr>
@@ -8969,7 +8825,7 @@
           <w:szCs w:val="24"/>
           <w:lang w:val="en-US"/>
         </w:rPr>
-        <w:t xml:space="preserve">, vol. 12, no. 24, pp. 51854-51865, 15 Dec.15, 2025, </w:t>
+        <w:t xml:space="preserve">, vol. 50, no. 12, pp. 3435-3453, Dec. 2024, </w:t>
       </w:r>
       <w:proofErr w:type="spellStart"/>
       <w:r>
@@ -8989,7 +8845,7 @@
           <w:szCs w:val="24"/>
           <w:lang w:val="en-US"/>
         </w:rPr>
-        <w:t>: 10.1109/JIOT.2025.3582427</w:t>
+        <w:t>: 10.1109/TSE.2024.3492204</w:t>
       </w:r>
     </w:p>
     <w:p>
@@ -9009,8 +8865,47 @@
           <w:szCs w:val="24"/>
           <w:lang w:val="en-US"/>
         </w:rPr>
-        <w:lastRenderedPageBreak/>
-        <w:t xml:space="preserve">[9] Z. Liu, Y. Tang, X. Luo, Y. Zhou and L. F. Zhang, "No Need to Lift a Finger Anymore? Assessing the Quality of Code Generation by ChatGPT," in </w:t>
+        <w:t>[8] X. Yi, C. Hu, B. Cai, H. Huang, Y. Chen and K. Wang, "</w:t>
+      </w:r>
+      <w:proofErr w:type="spellStart"/>
+      <w:r>
+        <w:rPr>
+          <w:rFonts w:ascii="Times New Roman" w:eastAsia="Times New Roman" w:hAnsi="Times New Roman" w:cs="Times New Roman"/>
+          <w:sz w:val="24"/>
+          <w:szCs w:val="24"/>
+          <w:lang w:val="en-US"/>
+        </w:rPr>
+        <w:t>FedALoRA</w:t>
+      </w:r>
+      <w:proofErr w:type="spellEnd"/>
+      <w:r>
+        <w:rPr>
+          <w:rFonts w:ascii="Times New Roman" w:eastAsia="Times New Roman" w:hAnsi="Times New Roman" w:cs="Times New Roman"/>
+          <w:sz w:val="24"/>
+          <w:szCs w:val="24"/>
+          <w:lang w:val="en-US"/>
+        </w:rPr>
+        <w:t xml:space="preserve">: Adaptive Local </w:t>
+      </w:r>
+      <w:proofErr w:type="spellStart"/>
+      <w:r>
+        <w:rPr>
+          <w:rFonts w:ascii="Times New Roman" w:eastAsia="Times New Roman" w:hAnsi="Times New Roman" w:cs="Times New Roman"/>
+          <w:sz w:val="24"/>
+          <w:szCs w:val="24"/>
+          <w:lang w:val="en-US"/>
+        </w:rPr>
+        <w:t>LoRA</w:t>
+      </w:r>
+      <w:proofErr w:type="spellEnd"/>
+      <w:r>
+        <w:rPr>
+          <w:rFonts w:ascii="Times New Roman" w:eastAsia="Times New Roman" w:hAnsi="Times New Roman" w:cs="Times New Roman"/>
+          <w:sz w:val="24"/>
+          <w:szCs w:val="24"/>
+          <w:lang w:val="en-US"/>
+        </w:rPr>
+        <w:t xml:space="preserve"> Aggregation for Personalized Federated Learning in LLM," in </w:t>
       </w:r>
       <w:r>
         <w:rPr>
@@ -9021,6 +8916,66 @@
           <w:szCs w:val="24"/>
           <w:lang w:val="en-US"/>
         </w:rPr>
+        <w:t>IEEE Internet of Things Journal</w:t>
+      </w:r>
+      <w:r>
+        <w:rPr>
+          <w:rFonts w:ascii="Times New Roman" w:eastAsia="Times New Roman" w:hAnsi="Times New Roman" w:cs="Times New Roman"/>
+          <w:sz w:val="24"/>
+          <w:szCs w:val="24"/>
+          <w:lang w:val="en-US"/>
+        </w:rPr>
+        <w:t xml:space="preserve">, vol. 12, no. 24, pp. 51854-51865, 15 Dec.15, 2025, </w:t>
+      </w:r>
+      <w:proofErr w:type="spellStart"/>
+      <w:r>
+        <w:rPr>
+          <w:rFonts w:ascii="Times New Roman" w:eastAsia="Times New Roman" w:hAnsi="Times New Roman" w:cs="Times New Roman"/>
+          <w:sz w:val="24"/>
+          <w:szCs w:val="24"/>
+          <w:lang w:val="en-US"/>
+        </w:rPr>
+        <w:t>doi</w:t>
+      </w:r>
+      <w:proofErr w:type="spellEnd"/>
+      <w:r>
+        <w:rPr>
+          <w:rFonts w:ascii="Times New Roman" w:eastAsia="Times New Roman" w:hAnsi="Times New Roman" w:cs="Times New Roman"/>
+          <w:sz w:val="24"/>
+          <w:szCs w:val="24"/>
+          <w:lang w:val="en-US"/>
+        </w:rPr>
+        <w:t>: 10.1109/JIOT.2025.3582427</w:t>
+      </w:r>
+    </w:p>
+    <w:p>
+      <w:pPr>
+        <w:spacing w:after="200" w:line="360" w:lineRule="auto"/>
+        <w:rPr>
+          <w:rFonts w:ascii="Times New Roman" w:eastAsia="Times New Roman" w:hAnsi="Times New Roman" w:cs="Times New Roman"/>
+          <w:sz w:val="24"/>
+          <w:szCs w:val="24"/>
+          <w:lang w:val="en-IN"/>
+        </w:rPr>
+      </w:pPr>
+      <w:r>
+        <w:rPr>
+          <w:rFonts w:ascii="Times New Roman" w:eastAsia="Times New Roman" w:hAnsi="Times New Roman" w:cs="Times New Roman"/>
+          <w:sz w:val="24"/>
+          <w:szCs w:val="24"/>
+          <w:lang w:val="en-US"/>
+        </w:rPr>
+        <w:t xml:space="preserve">[9] Z. Liu, Y. Tang, X. Luo, Y. Zhou and L. F. Zhang, "No Need to Lift a Finger Anymore? Assessing the Quality of Code Generation by ChatGPT," in </w:t>
+      </w:r>
+      <w:r>
+        <w:rPr>
+          <w:rFonts w:ascii="Times New Roman" w:eastAsia="Times New Roman" w:hAnsi="Times New Roman" w:cs="Times New Roman"/>
+          <w:i/>
+          <w:iCs/>
+          <w:sz w:val="24"/>
+          <w:szCs w:val="24"/>
+          <w:lang w:val="en-US"/>
+        </w:rPr>
         <w:t>IEEE Transactions on Software Engineering</w:t>
       </w:r>
       <w:r>
@@ -9110,6 +9065,7 @@
           <w:szCs w:val="24"/>
           <w:lang w:val="en-US"/>
         </w:rPr>
+        <w:lastRenderedPageBreak/>
         <w:t xml:space="preserve">[11] J. Liu, Y. Zhang, D. Wang, Y. Li and W. Dong, "THINK: Tackling API Hallucinations in LLMs via Injecting Knowledge," </w:t>
       </w:r>
       <w:r>

</xml_diff>